<commit_message>
CI: switch from Bitbucket Pipelines to GitHub Actions
</commit_message>
<xml_diff>
--- a/docs/Donation_Management_System_SRS_BRD.docx
+++ b/docs/Donation_Management_System_SRS_BRD.docx
@@ -26408,7 +26408,7 @@
                 <w:sz w:val="18"/>
                 <w:szCs w:val="18"/>
               </w:rPr>
-              <w:t xml:space="preserve">spatie/laravel-backup, Sentry (or similar), Bitbucket Pipelines</w:t>
+              <w:t xml:space="preserve">spatie/laravel-backup, Sentry (or similar), GitHub Actions</w:t>
             </w:r>
           </w:p>
         </w:tc>
@@ -36105,7 +36105,7 @@
                 <w:sz w:val="18"/>
                 <w:szCs w:val="18"/>
               </w:rPr>
-              <w:t xml:space="preserve">Install Filament 5, Pest, Larastan, Pint; set up Bitbucket Pipelines (lint + tests)</w:t>
+              <w:t xml:space="preserve">Install Filament 5, Pest, Larastan, Pint; set up GitHub Actions (lint + tests)</w:t>
             </w:r>
           </w:p>
         </w:tc>

</xml_diff>

<commit_message>
W01-D3: roles & permission matrix, staff users screen, super admin seeder (FR-ACC-02, §3.1)
</commit_message>
<xml_diff>
--- a/docs/Donation_Management_System_SRS_BRD.docx
+++ b/docs/Donation_Management_System_SRS_BRD.docx
@@ -25990,7 +25990,7 @@
                 <w:sz w:val="18"/>
                 <w:szCs w:val="18"/>
               </w:rPr>
-              <w:t xml:space="preserve">spatie/laravel-permission + Filament Shield</w:t>
+              <w:t xml:space="preserve">spatie/laravel-permission + config/permissions.php matrix</w:t>
             </w:r>
           </w:p>
         </w:tc>
@@ -26022,7 +26022,7 @@
                 <w:sz w:val="18"/>
                 <w:szCs w:val="18"/>
               </w:rPr>
-              <w:t xml:space="preserve">Role/permission UI generated per resource</w:t>
+              <w:t xml:space="preserve">Roles and permissions defined in code from §3.1; seeded, versioned in git</w:t>
             </w:r>
           </w:p>
         </w:tc>
@@ -36379,7 +36379,7 @@
                 <w:sz w:val="18"/>
                 <w:szCs w:val="18"/>
               </w:rPr>
-              <w:t xml:space="preserve">spatie/laravel-permission + Filament Shield; seed 7 roles and base permissions</w:t>
+              <w:t xml:space="preserve">spatie/laravel-permission + config/permissions.php matrix; seed 7 roles and permissions</w:t>
             </w:r>
           </w:p>
         </w:tc>

</xml_diff>

<commit_message>
W02-D5: funds permission area (Finance can manage funds), screen access matrix test, dashboard stats, demo data
</commit_message>
<xml_diff>
--- a/docs/Donation_Management_System_SRS_BRD.docx
+++ b/docs/Donation_Management_System_SRS_BRD.docx
@@ -296,7 +296,7 @@
                 <w:sz w:val="18"/>
                 <w:szCs w:val="18"/>
               </w:rPr>
-              <w:t xml:space="preserve">1.2 — Draft (Laravel 13 / Filament 5; card payments moved to Phase 2; WhatsApp via Green API)</w:t>
+              <w:t xml:space="preserve">1.3 — Draft (Laravel 13 / Filament 5; card payments Phase 2; WhatsApp via Green API; Funds permission area)</w:t>
             </w:r>
           </w:p>
         </w:tc>
@@ -6372,7 +6372,7 @@
                 <w:sz w:val="18"/>
                 <w:szCs w:val="18"/>
               </w:rPr>
-              <w:t xml:space="preserve">Funds &amp; campaigns</w:t>
+              <w:t xml:space="preserve">Funds</w:t>
             </w:r>
           </w:p>
         </w:tc>
@@ -6471,7 +6471,7 @@
                 <w:sz w:val="18"/>
                 <w:szCs w:val="18"/>
               </w:rPr>
-              <w:t xml:space="preserve">V</w:t>
+              <w:t xml:space="preserve">C</w:t>
             </w:r>
           </w:p>
         </w:tc>
@@ -6643,7 +6643,7 @@
                 <w:sz w:val="18"/>
                 <w:szCs w:val="18"/>
               </w:rPr>
-              <w:t xml:space="preserve">Donations &amp; payments</w:t>
+              <w:t xml:space="preserve">Campaigns &amp; updates</w:t>
             </w:r>
           </w:p>
         </w:tc>
@@ -6711,6 +6711,40 @@
                 <w:sz w:val="18"/>
                 <w:szCs w:val="18"/>
               </w:rPr>
+              <w:t xml:space="preserve">C</w:t>
+            </w:r>
+          </w:p>
+        </w:tc>
+        <w:tc>
+          <w:tcPr>
+            <w:tcW w:type="dxa" w:w="975"/>
+            <w:tcBorders>
+              <w:top w:val="single" w:color="C9D4E6" w:sz="4"/>
+              <w:left w:val="single" w:color="C9D4E6" w:sz="4"/>
+              <w:bottom w:val="single" w:color="C9D4E6" w:sz="4"/>
+              <w:right w:val="single" w:color="C9D4E6" w:sz="4"/>
+            </w:tcBorders>
+            <w:shd w:fill="F4F7FC" w:color="auto" w:val="clear"/>
+            <w:tcMar>
+              <w:top w:type="dxa" w:w="70"/>
+              <w:left w:type="dxa" w:w="100"/>
+              <w:bottom w:type="dxa" w:w="70"/>
+              <w:right w:type="dxa" w:w="100"/>
+            </w:tcMar>
+            <w:vAlign w:val="top"/>
+          </w:tcPr>
+          <w:p>
+            <w:pPr>
+              <w:spacing w:after="0" w:line="252"/>
+              <w:jc w:val="center"/>
+            </w:pPr>
+            <w:r>
+              <w:rPr>
+                <w:rFonts w:ascii="Calibri" w:cs="Calibri" w:eastAsia="Calibri" w:hAnsi="Calibri"/>
+                <w:color w:val="1A2433"/>
+                <w:sz w:val="18"/>
+                <w:szCs w:val="18"/>
+              </w:rPr>
               <w:t xml:space="preserve">V</w:t>
             </w:r>
           </w:p>
@@ -6746,40 +6780,6 @@
                 <w:szCs w:val="18"/>
               </w:rPr>
               <w:t xml:space="preserve">C</w:t>
-            </w:r>
-          </w:p>
-        </w:tc>
-        <w:tc>
-          <w:tcPr>
-            <w:tcW w:type="dxa" w:w="975"/>
-            <w:tcBorders>
-              <w:top w:val="single" w:color="C9D4E6" w:sz="4"/>
-              <w:left w:val="single" w:color="C9D4E6" w:sz="4"/>
-              <w:bottom w:val="single" w:color="C9D4E6" w:sz="4"/>
-              <w:right w:val="single" w:color="C9D4E6" w:sz="4"/>
-            </w:tcBorders>
-            <w:shd w:fill="F4F7FC" w:color="auto" w:val="clear"/>
-            <w:tcMar>
-              <w:top w:type="dxa" w:w="70"/>
-              <w:left w:type="dxa" w:w="100"/>
-              <w:bottom w:type="dxa" w:w="70"/>
-              <w:right w:type="dxa" w:w="100"/>
-            </w:tcMar>
-            <w:vAlign w:val="top"/>
-          </w:tcPr>
-          <w:p>
-            <w:pPr>
-              <w:spacing w:after="0" w:line="252"/>
-              <w:jc w:val="center"/>
-            </w:pPr>
-            <w:r>
-              <w:rPr>
-                <w:rFonts w:ascii="Calibri" w:cs="Calibri" w:eastAsia="Calibri" w:hAnsi="Calibri"/>
-                <w:color w:val="1A2433"/>
-                <w:sz w:val="18"/>
-                <w:szCs w:val="18"/>
-              </w:rPr>
-              <w:t xml:space="preserve">V</w:t>
             </w:r>
           </w:p>
         </w:tc>
@@ -6920,7 +6920,7 @@
                 <w:sz w:val="18"/>
                 <w:szCs w:val="18"/>
               </w:rPr>
-              <w:t xml:space="preserve">Proof verification</w:t>
+              <w:t xml:space="preserve">Donations &amp; payments</w:t>
             </w:r>
           </w:p>
         </w:tc>
@@ -6986,6 +6986,105 @@
                 <w:sz w:val="18"/>
                 <w:szCs w:val="18"/>
               </w:rPr>
+              <w:t xml:space="preserve">V</w:t>
+            </w:r>
+          </w:p>
+        </w:tc>
+        <w:tc>
+          <w:tcPr>
+            <w:tcW w:type="dxa" w:w="975"/>
+            <w:tcBorders>
+              <w:top w:val="single" w:color="C9D4E6" w:sz="4"/>
+              <w:left w:val="single" w:color="C9D4E6" w:sz="4"/>
+              <w:bottom w:val="single" w:color="C9D4E6" w:sz="4"/>
+              <w:right w:val="single" w:color="C9D4E6" w:sz="4"/>
+            </w:tcBorders>
+            <w:tcMar>
+              <w:top w:type="dxa" w:w="70"/>
+              <w:left w:type="dxa" w:w="100"/>
+              <w:bottom w:type="dxa" w:w="70"/>
+              <w:right w:type="dxa" w:w="100"/>
+            </w:tcMar>
+            <w:vAlign w:val="top"/>
+          </w:tcPr>
+          <w:p>
+            <w:pPr>
+              <w:spacing w:after="0" w:line="252"/>
+              <w:jc w:val="center"/>
+            </w:pPr>
+            <w:r>
+              <w:rPr>
+                <w:rFonts w:ascii="Calibri" w:cs="Calibri" w:eastAsia="Calibri" w:hAnsi="Calibri"/>
+                <w:color w:val="1A2433"/>
+                <w:sz w:val="18"/>
+                <w:szCs w:val="18"/>
+              </w:rPr>
+              <w:t xml:space="preserve">C</w:t>
+            </w:r>
+          </w:p>
+        </w:tc>
+        <w:tc>
+          <w:tcPr>
+            <w:tcW w:type="dxa" w:w="975"/>
+            <w:tcBorders>
+              <w:top w:val="single" w:color="C9D4E6" w:sz="4"/>
+              <w:left w:val="single" w:color="C9D4E6" w:sz="4"/>
+              <w:bottom w:val="single" w:color="C9D4E6" w:sz="4"/>
+              <w:right w:val="single" w:color="C9D4E6" w:sz="4"/>
+            </w:tcBorders>
+            <w:tcMar>
+              <w:top w:type="dxa" w:w="70"/>
+              <w:left w:type="dxa" w:w="100"/>
+              <w:bottom w:type="dxa" w:w="70"/>
+              <w:right w:type="dxa" w:w="100"/>
+            </w:tcMar>
+            <w:vAlign w:val="top"/>
+          </w:tcPr>
+          <w:p>
+            <w:pPr>
+              <w:spacing w:after="0" w:line="252"/>
+              <w:jc w:val="center"/>
+            </w:pPr>
+            <w:r>
+              <w:rPr>
+                <w:rFonts w:ascii="Calibri" w:cs="Calibri" w:eastAsia="Calibri" w:hAnsi="Calibri"/>
+                <w:color w:val="1A2433"/>
+                <w:sz w:val="18"/>
+                <w:szCs w:val="18"/>
+              </w:rPr>
+              <w:t xml:space="preserve">V</w:t>
+            </w:r>
+          </w:p>
+        </w:tc>
+        <w:tc>
+          <w:tcPr>
+            <w:tcW w:type="dxa" w:w="975"/>
+            <w:tcBorders>
+              <w:top w:val="single" w:color="C9D4E6" w:sz="4"/>
+              <w:left w:val="single" w:color="C9D4E6" w:sz="4"/>
+              <w:bottom w:val="single" w:color="C9D4E6" w:sz="4"/>
+              <w:right w:val="single" w:color="C9D4E6" w:sz="4"/>
+            </w:tcBorders>
+            <w:tcMar>
+              <w:top w:type="dxa" w:w="70"/>
+              <w:left w:type="dxa" w:w="100"/>
+              <w:bottom w:type="dxa" w:w="70"/>
+              <w:right w:type="dxa" w:w="100"/>
+            </w:tcMar>
+            <w:vAlign w:val="top"/>
+          </w:tcPr>
+          <w:p>
+            <w:pPr>
+              <w:spacing w:after="0" w:line="252"/>
+              <w:jc w:val="center"/>
+            </w:pPr>
+            <w:r>
+              <w:rPr>
+                <w:rFonts w:ascii="Calibri" w:cs="Calibri" w:eastAsia="Calibri" w:hAnsi="Calibri"/>
+                <w:color w:val="1A2433"/>
+                <w:sz w:val="18"/>
+                <w:szCs w:val="18"/>
+              </w:rPr>
               <w:t xml:space="preserve">-</w:t>
             </w:r>
           </w:p>
@@ -7019,106 +7118,7 @@
                 <w:sz w:val="18"/>
                 <w:szCs w:val="18"/>
               </w:rPr>
-              <w:t xml:space="preserve">A</w:t>
-            </w:r>
-          </w:p>
-        </w:tc>
-        <w:tc>
-          <w:tcPr>
-            <w:tcW w:type="dxa" w:w="975"/>
-            <w:tcBorders>
-              <w:top w:val="single" w:color="C9D4E6" w:sz="4"/>
-              <w:left w:val="single" w:color="C9D4E6" w:sz="4"/>
-              <w:bottom w:val="single" w:color="C9D4E6" w:sz="4"/>
-              <w:right w:val="single" w:color="C9D4E6" w:sz="4"/>
-            </w:tcBorders>
-            <w:tcMar>
-              <w:top w:type="dxa" w:w="70"/>
-              <w:left w:type="dxa" w:w="100"/>
-              <w:bottom w:type="dxa" w:w="70"/>
-              <w:right w:type="dxa" w:w="100"/>
-            </w:tcMar>
-            <w:vAlign w:val="top"/>
-          </w:tcPr>
-          <w:p>
-            <w:pPr>
-              <w:spacing w:after="0" w:line="252"/>
-              <w:jc w:val="center"/>
-            </w:pPr>
-            <w:r>
-              <w:rPr>
-                <w:rFonts w:ascii="Calibri" w:cs="Calibri" w:eastAsia="Calibri" w:hAnsi="Calibri"/>
-                <w:color w:val="1A2433"/>
-                <w:sz w:val="18"/>
-                <w:szCs w:val="18"/>
-              </w:rPr>
-              <w:t xml:space="preserve">-</w:t>
-            </w:r>
-          </w:p>
-        </w:tc>
-        <w:tc>
-          <w:tcPr>
-            <w:tcW w:type="dxa" w:w="975"/>
-            <w:tcBorders>
-              <w:top w:val="single" w:color="C9D4E6" w:sz="4"/>
-              <w:left w:val="single" w:color="C9D4E6" w:sz="4"/>
-              <w:bottom w:val="single" w:color="C9D4E6" w:sz="4"/>
-              <w:right w:val="single" w:color="C9D4E6" w:sz="4"/>
-            </w:tcBorders>
-            <w:tcMar>
-              <w:top w:type="dxa" w:w="70"/>
-              <w:left w:type="dxa" w:w="100"/>
-              <w:bottom w:type="dxa" w:w="70"/>
-              <w:right w:type="dxa" w:w="100"/>
-            </w:tcMar>
-            <w:vAlign w:val="top"/>
-          </w:tcPr>
-          <w:p>
-            <w:pPr>
-              <w:spacing w:after="0" w:line="252"/>
-              <w:jc w:val="center"/>
-            </w:pPr>
-            <w:r>
-              <w:rPr>
-                <w:rFonts w:ascii="Calibri" w:cs="Calibri" w:eastAsia="Calibri" w:hAnsi="Calibri"/>
-                <w:color w:val="1A2433"/>
-                <w:sz w:val="18"/>
-                <w:szCs w:val="18"/>
-              </w:rPr>
-              <w:t xml:space="preserve">-</w:t>
-            </w:r>
-          </w:p>
-        </w:tc>
-        <w:tc>
-          <w:tcPr>
-            <w:tcW w:type="dxa" w:w="975"/>
-            <w:tcBorders>
-              <w:top w:val="single" w:color="C9D4E6" w:sz="4"/>
-              <w:left w:val="single" w:color="C9D4E6" w:sz="4"/>
-              <w:bottom w:val="single" w:color="C9D4E6" w:sz="4"/>
-              <w:right w:val="single" w:color="C9D4E6" w:sz="4"/>
-            </w:tcBorders>
-            <w:tcMar>
-              <w:top w:type="dxa" w:w="70"/>
-              <w:left w:type="dxa" w:w="100"/>
-              <w:bottom w:type="dxa" w:w="70"/>
-              <w:right w:type="dxa" w:w="100"/>
-            </w:tcMar>
-            <w:vAlign w:val="top"/>
-          </w:tcPr>
-          <w:p>
-            <w:pPr>
-              <w:spacing w:after="0" w:line="252"/>
-              <w:jc w:val="center"/>
-            </w:pPr>
-            <w:r>
-              <w:rPr>
-                <w:rFonts w:ascii="Calibri" w:cs="Calibri" w:eastAsia="Calibri" w:hAnsi="Calibri"/>
-                <w:color w:val="1A2433"/>
-                <w:sz w:val="18"/>
-                <w:szCs w:val="18"/>
-              </w:rPr>
-              <w:t xml:space="preserve">-</w:t>
+              <w:t xml:space="preserve">V</w:t>
             </w:r>
           </w:p>
         </w:tc>
@@ -7191,7 +7191,7 @@
                 <w:sz w:val="18"/>
                 <w:szCs w:val="18"/>
               </w:rPr>
-              <w:t xml:space="preserve">Receipts &amp; certificates</w:t>
+              <w:t xml:space="preserve">Proof verification</w:t>
             </w:r>
           </w:p>
         </w:tc>
@@ -7259,7 +7259,7 @@
                 <w:sz w:val="18"/>
                 <w:szCs w:val="18"/>
               </w:rPr>
-              <w:t xml:space="preserve">V</w:t>
+              <w:t xml:space="preserve">-</w:t>
             </w:r>
           </w:p>
         </w:tc>
@@ -7293,7 +7293,7 @@
                 <w:sz w:val="18"/>
                 <w:szCs w:val="18"/>
               </w:rPr>
-              <w:t xml:space="preserve">C</w:t>
+              <w:t xml:space="preserve">A</w:t>
             </w:r>
           </w:p>
         </w:tc>
@@ -7468,7 +7468,7 @@
                 <w:sz w:val="18"/>
                 <w:szCs w:val="18"/>
               </w:rPr>
-              <w:t xml:space="preserve">Beneficiaries &amp; applications</w:t>
+              <w:t xml:space="preserve">Receipts &amp; certificates</w:t>
             </w:r>
           </w:p>
         </w:tc>
@@ -7534,6 +7534,39 @@
                 <w:sz w:val="18"/>
                 <w:szCs w:val="18"/>
               </w:rPr>
+              <w:t xml:space="preserve">V</w:t>
+            </w:r>
+          </w:p>
+        </w:tc>
+        <w:tc>
+          <w:tcPr>
+            <w:tcW w:type="dxa" w:w="975"/>
+            <w:tcBorders>
+              <w:top w:val="single" w:color="C9D4E6" w:sz="4"/>
+              <w:left w:val="single" w:color="C9D4E6" w:sz="4"/>
+              <w:bottom w:val="single" w:color="C9D4E6" w:sz="4"/>
+              <w:right w:val="single" w:color="C9D4E6" w:sz="4"/>
+            </w:tcBorders>
+            <w:tcMar>
+              <w:top w:type="dxa" w:w="70"/>
+              <w:left w:type="dxa" w:w="100"/>
+              <w:bottom w:type="dxa" w:w="70"/>
+              <w:right w:type="dxa" w:w="100"/>
+            </w:tcMar>
+            <w:vAlign w:val="top"/>
+          </w:tcPr>
+          <w:p>
+            <w:pPr>
+              <w:spacing w:after="0" w:line="252"/>
+              <w:jc w:val="center"/>
+            </w:pPr>
+            <w:r>
+              <w:rPr>
+                <w:rFonts w:ascii="Calibri" w:cs="Calibri" w:eastAsia="Calibri" w:hAnsi="Calibri"/>
+                <w:color w:val="1A2433"/>
+                <w:sz w:val="18"/>
+                <w:szCs w:val="18"/>
+              </w:rPr>
               <w:t xml:space="preserve">C</w:t>
             </w:r>
           </w:p>
@@ -7567,7 +7600,7 @@
                 <w:sz w:val="18"/>
                 <w:szCs w:val="18"/>
               </w:rPr>
-              <w:t xml:space="preserve">V</w:t>
+              <w:t xml:space="preserve">-</w:t>
             </w:r>
           </w:p>
         </w:tc>
@@ -7633,40 +7666,7 @@
                 <w:sz w:val="18"/>
                 <w:szCs w:val="18"/>
               </w:rPr>
-              <w:t xml:space="preserve">C</w:t>
-            </w:r>
-          </w:p>
-        </w:tc>
-        <w:tc>
-          <w:tcPr>
-            <w:tcW w:type="dxa" w:w="975"/>
-            <w:tcBorders>
-              <w:top w:val="single" w:color="C9D4E6" w:sz="4"/>
-              <w:left w:val="single" w:color="C9D4E6" w:sz="4"/>
-              <w:bottom w:val="single" w:color="C9D4E6" w:sz="4"/>
-              <w:right w:val="single" w:color="C9D4E6" w:sz="4"/>
-            </w:tcBorders>
-            <w:tcMar>
-              <w:top w:type="dxa" w:w="70"/>
-              <w:left w:type="dxa" w:w="100"/>
-              <w:bottom w:type="dxa" w:w="70"/>
-              <w:right w:type="dxa" w:w="100"/>
-            </w:tcMar>
-            <w:vAlign w:val="top"/>
-          </w:tcPr>
-          <w:p>
-            <w:pPr>
-              <w:spacing w:after="0" w:line="252"/>
-              <w:jc w:val="center"/>
-            </w:pPr>
-            <w:r>
-              <w:rPr>
-                <w:rFonts w:ascii="Calibri" w:cs="Calibri" w:eastAsia="Calibri" w:hAnsi="Calibri"/>
-                <w:color w:val="1A2433"/>
-                <w:sz w:val="18"/>
-                <w:szCs w:val="18"/>
-              </w:rPr>
-              <w:t xml:space="preserve">V</w:t>
+              <w:t xml:space="preserve">-</w:t>
             </w:r>
           </w:p>
         </w:tc>
@@ -7739,7 +7739,7 @@
                 <w:sz w:val="18"/>
                 <w:szCs w:val="18"/>
               </w:rPr>
-              <w:t xml:space="preserve">Disbursements</w:t>
+              <w:t xml:space="preserve">Beneficiaries &amp; applications</w:t>
             </w:r>
           </w:p>
         </w:tc>
@@ -7807,7 +7807,7 @@
                 <w:sz w:val="18"/>
                 <w:szCs w:val="18"/>
               </w:rPr>
-              <w:t xml:space="preserve">A</w:t>
+              <w:t xml:space="preserve">C</w:t>
             </w:r>
           </w:p>
         </w:tc>
@@ -7841,6 +7841,74 @@
                 <w:sz w:val="18"/>
                 <w:szCs w:val="18"/>
               </w:rPr>
+              <w:t xml:space="preserve">V</w:t>
+            </w:r>
+          </w:p>
+        </w:tc>
+        <w:tc>
+          <w:tcPr>
+            <w:tcW w:type="dxa" w:w="975"/>
+            <w:tcBorders>
+              <w:top w:val="single" w:color="C9D4E6" w:sz="4"/>
+              <w:left w:val="single" w:color="C9D4E6" w:sz="4"/>
+              <w:bottom w:val="single" w:color="C9D4E6" w:sz="4"/>
+              <w:right w:val="single" w:color="C9D4E6" w:sz="4"/>
+            </w:tcBorders>
+            <w:shd w:fill="F4F7FC" w:color="auto" w:val="clear"/>
+            <w:tcMar>
+              <w:top w:type="dxa" w:w="70"/>
+              <w:left w:type="dxa" w:w="100"/>
+              <w:bottom w:type="dxa" w:w="70"/>
+              <w:right w:type="dxa" w:w="100"/>
+            </w:tcMar>
+            <w:vAlign w:val="top"/>
+          </w:tcPr>
+          <w:p>
+            <w:pPr>
+              <w:spacing w:after="0" w:line="252"/>
+              <w:jc w:val="center"/>
+            </w:pPr>
+            <w:r>
+              <w:rPr>
+                <w:rFonts w:ascii="Calibri" w:cs="Calibri" w:eastAsia="Calibri" w:hAnsi="Calibri"/>
+                <w:color w:val="1A2433"/>
+                <w:sz w:val="18"/>
+                <w:szCs w:val="18"/>
+              </w:rPr>
+              <w:t xml:space="preserve">-</w:t>
+            </w:r>
+          </w:p>
+        </w:tc>
+        <w:tc>
+          <w:tcPr>
+            <w:tcW w:type="dxa" w:w="975"/>
+            <w:tcBorders>
+              <w:top w:val="single" w:color="C9D4E6" w:sz="4"/>
+              <w:left w:val="single" w:color="C9D4E6" w:sz="4"/>
+              <w:bottom w:val="single" w:color="C9D4E6" w:sz="4"/>
+              <w:right w:val="single" w:color="C9D4E6" w:sz="4"/>
+            </w:tcBorders>
+            <w:shd w:fill="F4F7FC" w:color="auto" w:val="clear"/>
+            <w:tcMar>
+              <w:top w:type="dxa" w:w="70"/>
+              <w:left w:type="dxa" w:w="100"/>
+              <w:bottom w:type="dxa" w:w="70"/>
+              <w:right w:type="dxa" w:w="100"/>
+            </w:tcMar>
+            <w:vAlign w:val="top"/>
+          </w:tcPr>
+          <w:p>
+            <w:pPr>
+              <w:spacing w:after="0" w:line="252"/>
+              <w:jc w:val="center"/>
+            </w:pPr>
+            <w:r>
+              <w:rPr>
+                <w:rFonts w:ascii="Calibri" w:cs="Calibri" w:eastAsia="Calibri" w:hAnsi="Calibri"/>
+                <w:color w:val="1A2433"/>
+                <w:sz w:val="18"/>
+                <w:szCs w:val="18"/>
+              </w:rPr>
               <w:t xml:space="preserve">C</w:t>
             </w:r>
           </w:p>
@@ -7875,75 +7943,7 @@
                 <w:sz w:val="18"/>
                 <w:szCs w:val="18"/>
               </w:rPr>
-              <w:t xml:space="preserve">-</w:t>
-            </w:r>
-          </w:p>
-        </w:tc>
-        <w:tc>
-          <w:tcPr>
-            <w:tcW w:type="dxa" w:w="975"/>
-            <w:tcBorders>
-              <w:top w:val="single" w:color="C9D4E6" w:sz="4"/>
-              <w:left w:val="single" w:color="C9D4E6" w:sz="4"/>
-              <w:bottom w:val="single" w:color="C9D4E6" w:sz="4"/>
-              <w:right w:val="single" w:color="C9D4E6" w:sz="4"/>
-            </w:tcBorders>
-            <w:shd w:fill="F4F7FC" w:color="auto" w:val="clear"/>
-            <w:tcMar>
-              <w:top w:type="dxa" w:w="70"/>
-              <w:left w:type="dxa" w:w="100"/>
-              <w:bottom w:type="dxa" w:w="70"/>
-              <w:right w:type="dxa" w:w="100"/>
-            </w:tcMar>
-            <w:vAlign w:val="top"/>
-          </w:tcPr>
-          <w:p>
-            <w:pPr>
-              <w:spacing w:after="0" w:line="252"/>
-              <w:jc w:val="center"/>
-            </w:pPr>
-            <w:r>
-              <w:rPr>
-                <w:rFonts w:ascii="Calibri" w:cs="Calibri" w:eastAsia="Calibri" w:hAnsi="Calibri"/>
-                <w:color w:val="1A2433"/>
-                <w:sz w:val="18"/>
-                <w:szCs w:val="18"/>
-              </w:rPr>
-              <w:t xml:space="preserve">C</w:t>
-            </w:r>
-          </w:p>
-        </w:tc>
-        <w:tc>
-          <w:tcPr>
-            <w:tcW w:type="dxa" w:w="975"/>
-            <w:tcBorders>
-              <w:top w:val="single" w:color="C9D4E6" w:sz="4"/>
-              <w:left w:val="single" w:color="C9D4E6" w:sz="4"/>
-              <w:bottom w:val="single" w:color="C9D4E6" w:sz="4"/>
-              <w:right w:val="single" w:color="C9D4E6" w:sz="4"/>
-            </w:tcBorders>
-            <w:shd w:fill="F4F7FC" w:color="auto" w:val="clear"/>
-            <w:tcMar>
-              <w:top w:type="dxa" w:w="70"/>
-              <w:left w:type="dxa" w:w="100"/>
-              <w:bottom w:type="dxa" w:w="70"/>
-              <w:right w:type="dxa" w:w="100"/>
-            </w:tcMar>
-            <w:vAlign w:val="top"/>
-          </w:tcPr>
-          <w:p>
-            <w:pPr>
-              <w:spacing w:after="0" w:line="252"/>
-              <w:jc w:val="center"/>
-            </w:pPr>
-            <w:r>
-              <w:rPr>
-                <w:rFonts w:ascii="Calibri" w:cs="Calibri" w:eastAsia="Calibri" w:hAnsi="Calibri"/>
-                <w:color w:val="1A2433"/>
-                <w:sz w:val="18"/>
-                <w:szCs w:val="18"/>
-              </w:rPr>
-              <w:t xml:space="preserve">A</w:t>
+              <w:t xml:space="preserve">V</w:t>
             </w:r>
           </w:p>
         </w:tc>
@@ -8016,7 +8016,7 @@
                 <w:sz w:val="18"/>
                 <w:szCs w:val="18"/>
               </w:rPr>
-              <w:t xml:space="preserve">Qurbani &amp; inventory</w:t>
+              <w:t xml:space="preserve">Disbursements</w:t>
             </w:r>
           </w:p>
         </w:tc>
@@ -8082,6 +8082,39 @@
                 <w:sz w:val="18"/>
                 <w:szCs w:val="18"/>
               </w:rPr>
+              <w:t xml:space="preserve">A</w:t>
+            </w:r>
+          </w:p>
+        </w:tc>
+        <w:tc>
+          <w:tcPr>
+            <w:tcW w:type="dxa" w:w="975"/>
+            <w:tcBorders>
+              <w:top w:val="single" w:color="C9D4E6" w:sz="4"/>
+              <w:left w:val="single" w:color="C9D4E6" w:sz="4"/>
+              <w:bottom w:val="single" w:color="C9D4E6" w:sz="4"/>
+              <w:right w:val="single" w:color="C9D4E6" w:sz="4"/>
+            </w:tcBorders>
+            <w:tcMar>
+              <w:top w:type="dxa" w:w="70"/>
+              <w:left w:type="dxa" w:w="100"/>
+              <w:bottom w:type="dxa" w:w="70"/>
+              <w:right w:type="dxa" w:w="100"/>
+            </w:tcMar>
+            <w:vAlign w:val="top"/>
+          </w:tcPr>
+          <w:p>
+            <w:pPr>
+              <w:spacing w:after="0" w:line="252"/>
+              <w:jc w:val="center"/>
+            </w:pPr>
+            <w:r>
+              <w:rPr>
+                <w:rFonts w:ascii="Calibri" w:cs="Calibri" w:eastAsia="Calibri" w:hAnsi="Calibri"/>
+                <w:color w:val="1A2433"/>
+                <w:sz w:val="18"/>
+                <w:szCs w:val="18"/>
+              </w:rPr>
               <w:t xml:space="preserve">C</w:t>
             </w:r>
           </w:p>
@@ -8115,6 +8148,39 @@
                 <w:sz w:val="18"/>
                 <w:szCs w:val="18"/>
               </w:rPr>
+              <w:t xml:space="preserve">-</w:t>
+            </w:r>
+          </w:p>
+        </w:tc>
+        <w:tc>
+          <w:tcPr>
+            <w:tcW w:type="dxa" w:w="975"/>
+            <w:tcBorders>
+              <w:top w:val="single" w:color="C9D4E6" w:sz="4"/>
+              <w:left w:val="single" w:color="C9D4E6" w:sz="4"/>
+              <w:bottom w:val="single" w:color="C9D4E6" w:sz="4"/>
+              <w:right w:val="single" w:color="C9D4E6" w:sz="4"/>
+            </w:tcBorders>
+            <w:tcMar>
+              <w:top w:type="dxa" w:w="70"/>
+              <w:left w:type="dxa" w:w="100"/>
+              <w:bottom w:type="dxa" w:w="70"/>
+              <w:right w:type="dxa" w:w="100"/>
+            </w:tcMar>
+            <w:vAlign w:val="top"/>
+          </w:tcPr>
+          <w:p>
+            <w:pPr>
+              <w:spacing w:after="0" w:line="252"/>
+              <w:jc w:val="center"/>
+            </w:pPr>
+            <w:r>
+              <w:rPr>
+                <w:rFonts w:ascii="Calibri" w:cs="Calibri" w:eastAsia="Calibri" w:hAnsi="Calibri"/>
+                <w:color w:val="1A2433"/>
+                <w:sz w:val="18"/>
+                <w:szCs w:val="18"/>
+              </w:rPr>
               <w:t xml:space="preserve">C</w:t>
             </w:r>
           </w:p>
@@ -8148,73 +8214,7 @@
                 <w:sz w:val="18"/>
                 <w:szCs w:val="18"/>
               </w:rPr>
-              <w:t xml:space="preserve">C</w:t>
-            </w:r>
-          </w:p>
-        </w:tc>
-        <w:tc>
-          <w:tcPr>
-            <w:tcW w:type="dxa" w:w="975"/>
-            <w:tcBorders>
-              <w:top w:val="single" w:color="C9D4E6" w:sz="4"/>
-              <w:left w:val="single" w:color="C9D4E6" w:sz="4"/>
-              <w:bottom w:val="single" w:color="C9D4E6" w:sz="4"/>
-              <w:right w:val="single" w:color="C9D4E6" w:sz="4"/>
-            </w:tcBorders>
-            <w:tcMar>
-              <w:top w:type="dxa" w:w="70"/>
-              <w:left w:type="dxa" w:w="100"/>
-              <w:bottom w:type="dxa" w:w="70"/>
-              <w:right w:type="dxa" w:w="100"/>
-            </w:tcMar>
-            <w:vAlign w:val="top"/>
-          </w:tcPr>
-          <w:p>
-            <w:pPr>
-              <w:spacing w:after="0" w:line="252"/>
-              <w:jc w:val="center"/>
-            </w:pPr>
-            <w:r>
-              <w:rPr>
-                <w:rFonts w:ascii="Calibri" w:cs="Calibri" w:eastAsia="Calibri" w:hAnsi="Calibri"/>
-                <w:color w:val="1A2433"/>
-                <w:sz w:val="18"/>
-                <w:szCs w:val="18"/>
-              </w:rPr>
-              <w:t xml:space="preserve">C</w:t>
-            </w:r>
-          </w:p>
-        </w:tc>
-        <w:tc>
-          <w:tcPr>
-            <w:tcW w:type="dxa" w:w="975"/>
-            <w:tcBorders>
-              <w:top w:val="single" w:color="C9D4E6" w:sz="4"/>
-              <w:left w:val="single" w:color="C9D4E6" w:sz="4"/>
-              <w:bottom w:val="single" w:color="C9D4E6" w:sz="4"/>
-              <w:right w:val="single" w:color="C9D4E6" w:sz="4"/>
-            </w:tcBorders>
-            <w:tcMar>
-              <w:top w:type="dxa" w:w="70"/>
-              <w:left w:type="dxa" w:w="100"/>
-              <w:bottom w:type="dxa" w:w="70"/>
-              <w:right w:type="dxa" w:w="100"/>
-            </w:tcMar>
-            <w:vAlign w:val="top"/>
-          </w:tcPr>
-          <w:p>
-            <w:pPr>
-              <w:spacing w:after="0" w:line="252"/>
-              <w:jc w:val="center"/>
-            </w:pPr>
-            <w:r>
-              <w:rPr>
-                <w:rFonts w:ascii="Calibri" w:cs="Calibri" w:eastAsia="Calibri" w:hAnsi="Calibri"/>
-                <w:color w:val="1A2433"/>
-                <w:sz w:val="18"/>
-                <w:szCs w:val="18"/>
-              </w:rPr>
-              <w:t xml:space="preserve">V</w:t>
+              <w:t xml:space="preserve">A</w:t>
             </w:r>
           </w:p>
         </w:tc>
@@ -8287,7 +8287,7 @@
                 <w:sz w:val="18"/>
                 <w:szCs w:val="18"/>
               </w:rPr>
-              <w:t xml:space="preserve">Ledger &amp; reconciliation</w:t>
+              <w:t xml:space="preserve">Qurbani &amp; inventory</w:t>
             </w:r>
           </w:p>
         </w:tc>
@@ -8355,7 +8355,7 @@
                 <w:sz w:val="18"/>
                 <w:szCs w:val="18"/>
               </w:rPr>
-              <w:t xml:space="preserve">V</w:t>
+              <w:t xml:space="preserve">C</w:t>
             </w:r>
           </w:p>
         </w:tc>
@@ -8423,7 +8423,7 @@
                 <w:sz w:val="18"/>
                 <w:szCs w:val="18"/>
               </w:rPr>
-              <w:t xml:space="preserve">-</w:t>
+              <w:t xml:space="preserve">C</w:t>
             </w:r>
           </w:p>
         </w:tc>
@@ -8457,7 +8457,7 @@
                 <w:sz w:val="18"/>
                 <w:szCs w:val="18"/>
               </w:rPr>
-              <w:t xml:space="preserve">-</w:t>
+              <w:t xml:space="preserve">C</w:t>
             </w:r>
           </w:p>
         </w:tc>
@@ -8564,7 +8564,7 @@
                 <w:sz w:val="18"/>
                 <w:szCs w:val="18"/>
               </w:rPr>
-              <w:t xml:space="preserve">Reports &amp; dashboard</w:t>
+              <w:t xml:space="preserve">Ledger &amp; reconciliation</w:t>
             </w:r>
           </w:p>
         </w:tc>
@@ -8663,7 +8663,7 @@
                 <w:sz w:val="18"/>
                 <w:szCs w:val="18"/>
               </w:rPr>
-              <w:t xml:space="preserve">V</w:t>
+              <w:t xml:space="preserve">C</w:t>
             </w:r>
           </w:p>
         </w:tc>
@@ -8696,7 +8696,7 @@
                 <w:sz w:val="18"/>
                 <w:szCs w:val="18"/>
               </w:rPr>
-              <w:t xml:space="preserve">V</w:t>
+              <w:t xml:space="preserve">-</w:t>
             </w:r>
           </w:p>
         </w:tc>
@@ -8729,7 +8729,7 @@
                 <w:sz w:val="18"/>
                 <w:szCs w:val="18"/>
               </w:rPr>
-              <w:t xml:space="preserve">V</w:t>
+              <w:t xml:space="preserve">-</w:t>
             </w:r>
           </w:p>
         </w:tc>
@@ -8835,7 +8835,7 @@
                 <w:sz w:val="18"/>
                 <w:szCs w:val="18"/>
               </w:rPr>
-              <w:t xml:space="preserve">CMS content</w:t>
+              <w:t xml:space="preserve">Reports &amp; dashboard</w:t>
             </w:r>
           </w:p>
         </w:tc>
@@ -8903,7 +8903,7 @@
                 <w:sz w:val="18"/>
                 <w:szCs w:val="18"/>
               </w:rPr>
-              <w:t xml:space="preserve">C</w:t>
+              <w:t xml:space="preserve">V</w:t>
             </w:r>
           </w:p>
         </w:tc>
@@ -8937,7 +8937,7 @@
                 <w:sz w:val="18"/>
                 <w:szCs w:val="18"/>
               </w:rPr>
-              <w:t xml:space="preserve">-</w:t>
+              <w:t xml:space="preserve">V</w:t>
             </w:r>
           </w:p>
         </w:tc>
@@ -8971,7 +8971,7 @@
                 <w:sz w:val="18"/>
                 <w:szCs w:val="18"/>
               </w:rPr>
-              <w:t xml:space="preserve">C</w:t>
+              <w:t xml:space="preserve">V</w:t>
             </w:r>
           </w:p>
         </w:tc>
@@ -9005,7 +9005,7 @@
                 <w:sz w:val="18"/>
                 <w:szCs w:val="18"/>
               </w:rPr>
-              <w:t xml:space="preserve">-</w:t>
+              <w:t xml:space="preserve">V</w:t>
             </w:r>
           </w:p>
         </w:tc>
@@ -9039,7 +9039,7 @@
                 <w:sz w:val="18"/>
                 <w:szCs w:val="18"/>
               </w:rPr>
-              <w:t xml:space="preserve">-</w:t>
+              <w:t xml:space="preserve">V</w:t>
             </w:r>
           </w:p>
         </w:tc>
@@ -9073,7 +9073,7 @@
                 <w:sz w:val="18"/>
                 <w:szCs w:val="18"/>
               </w:rPr>
-              <w:t xml:space="preserve">-</w:t>
+              <w:t xml:space="preserve">V</w:t>
             </w:r>
           </w:p>
         </w:tc>
@@ -9112,6 +9112,277 @@
                 <w:sz w:val="18"/>
                 <w:szCs w:val="18"/>
               </w:rPr>
+              <w:t xml:space="preserve">CMS content</w:t>
+            </w:r>
+          </w:p>
+        </w:tc>
+        <w:tc>
+          <w:tcPr>
+            <w:tcW w:type="dxa" w:w="975"/>
+            <w:tcBorders>
+              <w:top w:val="single" w:color="C9D4E6" w:sz="4"/>
+              <w:left w:val="single" w:color="C9D4E6" w:sz="4"/>
+              <w:bottom w:val="single" w:color="C9D4E6" w:sz="4"/>
+              <w:right w:val="single" w:color="C9D4E6" w:sz="4"/>
+            </w:tcBorders>
+            <w:tcMar>
+              <w:top w:type="dxa" w:w="70"/>
+              <w:left w:type="dxa" w:w="100"/>
+              <w:bottom w:type="dxa" w:w="70"/>
+              <w:right w:type="dxa" w:w="100"/>
+            </w:tcMar>
+            <w:vAlign w:val="top"/>
+          </w:tcPr>
+          <w:p>
+            <w:pPr>
+              <w:spacing w:after="0" w:line="252"/>
+              <w:jc w:val="center"/>
+            </w:pPr>
+            <w:r>
+              <w:rPr>
+                <w:rFonts w:ascii="Calibri" w:cs="Calibri" w:eastAsia="Calibri" w:hAnsi="Calibri"/>
+                <w:color w:val="1A2433"/>
+                <w:sz w:val="18"/>
+                <w:szCs w:val="18"/>
+              </w:rPr>
+              <w:t xml:space="preserve">F</w:t>
+            </w:r>
+          </w:p>
+        </w:tc>
+        <w:tc>
+          <w:tcPr>
+            <w:tcW w:type="dxa" w:w="975"/>
+            <w:tcBorders>
+              <w:top w:val="single" w:color="C9D4E6" w:sz="4"/>
+              <w:left w:val="single" w:color="C9D4E6" w:sz="4"/>
+              <w:bottom w:val="single" w:color="C9D4E6" w:sz="4"/>
+              <w:right w:val="single" w:color="C9D4E6" w:sz="4"/>
+            </w:tcBorders>
+            <w:tcMar>
+              <w:top w:type="dxa" w:w="70"/>
+              <w:left w:type="dxa" w:w="100"/>
+              <w:bottom w:type="dxa" w:w="70"/>
+              <w:right w:type="dxa" w:w="100"/>
+            </w:tcMar>
+            <w:vAlign w:val="top"/>
+          </w:tcPr>
+          <w:p>
+            <w:pPr>
+              <w:spacing w:after="0" w:line="252"/>
+              <w:jc w:val="center"/>
+            </w:pPr>
+            <w:r>
+              <w:rPr>
+                <w:rFonts w:ascii="Calibri" w:cs="Calibri" w:eastAsia="Calibri" w:hAnsi="Calibri"/>
+                <w:color w:val="1A2433"/>
+                <w:sz w:val="18"/>
+                <w:szCs w:val="18"/>
+              </w:rPr>
+              <w:t xml:space="preserve">C</w:t>
+            </w:r>
+          </w:p>
+        </w:tc>
+        <w:tc>
+          <w:tcPr>
+            <w:tcW w:type="dxa" w:w="975"/>
+            <w:tcBorders>
+              <w:top w:val="single" w:color="C9D4E6" w:sz="4"/>
+              <w:left w:val="single" w:color="C9D4E6" w:sz="4"/>
+              <w:bottom w:val="single" w:color="C9D4E6" w:sz="4"/>
+              <w:right w:val="single" w:color="C9D4E6" w:sz="4"/>
+            </w:tcBorders>
+            <w:tcMar>
+              <w:top w:type="dxa" w:w="70"/>
+              <w:left w:type="dxa" w:w="100"/>
+              <w:bottom w:type="dxa" w:w="70"/>
+              <w:right w:type="dxa" w:w="100"/>
+            </w:tcMar>
+            <w:vAlign w:val="top"/>
+          </w:tcPr>
+          <w:p>
+            <w:pPr>
+              <w:spacing w:after="0" w:line="252"/>
+              <w:jc w:val="center"/>
+            </w:pPr>
+            <w:r>
+              <w:rPr>
+                <w:rFonts w:ascii="Calibri" w:cs="Calibri" w:eastAsia="Calibri" w:hAnsi="Calibri"/>
+                <w:color w:val="1A2433"/>
+                <w:sz w:val="18"/>
+                <w:szCs w:val="18"/>
+              </w:rPr>
+              <w:t xml:space="preserve">-</w:t>
+            </w:r>
+          </w:p>
+        </w:tc>
+        <w:tc>
+          <w:tcPr>
+            <w:tcW w:type="dxa" w:w="975"/>
+            <w:tcBorders>
+              <w:top w:val="single" w:color="C9D4E6" w:sz="4"/>
+              <w:left w:val="single" w:color="C9D4E6" w:sz="4"/>
+              <w:bottom w:val="single" w:color="C9D4E6" w:sz="4"/>
+              <w:right w:val="single" w:color="C9D4E6" w:sz="4"/>
+            </w:tcBorders>
+            <w:tcMar>
+              <w:top w:type="dxa" w:w="70"/>
+              <w:left w:type="dxa" w:w="100"/>
+              <w:bottom w:type="dxa" w:w="70"/>
+              <w:right w:type="dxa" w:w="100"/>
+            </w:tcMar>
+            <w:vAlign w:val="top"/>
+          </w:tcPr>
+          <w:p>
+            <w:pPr>
+              <w:spacing w:after="0" w:line="252"/>
+              <w:jc w:val="center"/>
+            </w:pPr>
+            <w:r>
+              <w:rPr>
+                <w:rFonts w:ascii="Calibri" w:cs="Calibri" w:eastAsia="Calibri" w:hAnsi="Calibri"/>
+                <w:color w:val="1A2433"/>
+                <w:sz w:val="18"/>
+                <w:szCs w:val="18"/>
+              </w:rPr>
+              <w:t xml:space="preserve">C</w:t>
+            </w:r>
+          </w:p>
+        </w:tc>
+        <w:tc>
+          <w:tcPr>
+            <w:tcW w:type="dxa" w:w="975"/>
+            <w:tcBorders>
+              <w:top w:val="single" w:color="C9D4E6" w:sz="4"/>
+              <w:left w:val="single" w:color="C9D4E6" w:sz="4"/>
+              <w:bottom w:val="single" w:color="C9D4E6" w:sz="4"/>
+              <w:right w:val="single" w:color="C9D4E6" w:sz="4"/>
+            </w:tcBorders>
+            <w:tcMar>
+              <w:top w:type="dxa" w:w="70"/>
+              <w:left w:type="dxa" w:w="100"/>
+              <w:bottom w:type="dxa" w:w="70"/>
+              <w:right w:type="dxa" w:w="100"/>
+            </w:tcMar>
+            <w:vAlign w:val="top"/>
+          </w:tcPr>
+          <w:p>
+            <w:pPr>
+              <w:spacing w:after="0" w:line="252"/>
+              <w:jc w:val="center"/>
+            </w:pPr>
+            <w:r>
+              <w:rPr>
+                <w:rFonts w:ascii="Calibri" w:cs="Calibri" w:eastAsia="Calibri" w:hAnsi="Calibri"/>
+                <w:color w:val="1A2433"/>
+                <w:sz w:val="18"/>
+                <w:szCs w:val="18"/>
+              </w:rPr>
+              <w:t xml:space="preserve">-</w:t>
+            </w:r>
+          </w:p>
+        </w:tc>
+        <w:tc>
+          <w:tcPr>
+            <w:tcW w:type="dxa" w:w="975"/>
+            <w:tcBorders>
+              <w:top w:val="single" w:color="C9D4E6" w:sz="4"/>
+              <w:left w:val="single" w:color="C9D4E6" w:sz="4"/>
+              <w:bottom w:val="single" w:color="C9D4E6" w:sz="4"/>
+              <w:right w:val="single" w:color="C9D4E6" w:sz="4"/>
+            </w:tcBorders>
+            <w:tcMar>
+              <w:top w:type="dxa" w:w="70"/>
+              <w:left w:type="dxa" w:w="100"/>
+              <w:bottom w:type="dxa" w:w="70"/>
+              <w:right w:type="dxa" w:w="100"/>
+            </w:tcMar>
+            <w:vAlign w:val="top"/>
+          </w:tcPr>
+          <w:p>
+            <w:pPr>
+              <w:spacing w:after="0" w:line="252"/>
+              <w:jc w:val="center"/>
+            </w:pPr>
+            <w:r>
+              <w:rPr>
+                <w:rFonts w:ascii="Calibri" w:cs="Calibri" w:eastAsia="Calibri" w:hAnsi="Calibri"/>
+                <w:color w:val="1A2433"/>
+                <w:sz w:val="18"/>
+                <w:szCs w:val="18"/>
+              </w:rPr>
+              <w:t xml:space="preserve">-</w:t>
+            </w:r>
+          </w:p>
+        </w:tc>
+        <w:tc>
+          <w:tcPr>
+            <w:tcW w:type="dxa" w:w="972"/>
+            <w:tcBorders>
+              <w:top w:val="single" w:color="C9D4E6" w:sz="4"/>
+              <w:left w:val="single" w:color="C9D4E6" w:sz="4"/>
+              <w:bottom w:val="single" w:color="C9D4E6" w:sz="4"/>
+              <w:right w:val="single" w:color="C9D4E6" w:sz="4"/>
+            </w:tcBorders>
+            <w:tcMar>
+              <w:top w:type="dxa" w:w="70"/>
+              <w:left w:type="dxa" w:w="100"/>
+              <w:bottom w:type="dxa" w:w="70"/>
+              <w:right w:type="dxa" w:w="100"/>
+            </w:tcMar>
+            <w:vAlign w:val="top"/>
+          </w:tcPr>
+          <w:p>
+            <w:pPr>
+              <w:spacing w:after="0" w:line="252"/>
+              <w:jc w:val="center"/>
+            </w:pPr>
+            <w:r>
+              <w:rPr>
+                <w:rFonts w:ascii="Calibri" w:cs="Calibri" w:eastAsia="Calibri" w:hAnsi="Calibri"/>
+                <w:color w:val="1A2433"/>
+                <w:sz w:val="18"/>
+                <w:szCs w:val="18"/>
+              </w:rPr>
+              <w:t xml:space="preserve">-</w:t>
+            </w:r>
+          </w:p>
+        </w:tc>
+      </w:tr>
+      <w:tr>
+        <w:trPr>
+          <w:cantSplit/>
+        </w:trPr>
+        <w:tc>
+          <w:tcPr>
+            <w:tcW w:type="dxa" w:w="2924"/>
+            <w:tcBorders>
+              <w:top w:val="single" w:color="C9D4E6" w:sz="4"/>
+              <w:left w:val="single" w:color="C9D4E6" w:sz="4"/>
+              <w:bottom w:val="single" w:color="C9D4E6" w:sz="4"/>
+              <w:right w:val="single" w:color="C9D4E6" w:sz="4"/>
+            </w:tcBorders>
+            <w:shd w:fill="F4F7FC" w:color="auto" w:val="clear"/>
+            <w:tcMar>
+              <w:top w:type="dxa" w:w="70"/>
+              <w:left w:type="dxa" w:w="100"/>
+              <w:bottom w:type="dxa" w:w="70"/>
+              <w:right w:type="dxa" w:w="100"/>
+            </w:tcMar>
+            <w:vAlign w:val="top"/>
+          </w:tcPr>
+          <w:p>
+            <w:pPr>
+              <w:spacing w:after="0" w:line="252"/>
+            </w:pPr>
+            <w:r>
+              <w:rPr>
+                <w:rFonts w:ascii="Calibri" w:cs="Calibri" w:eastAsia="Calibri" w:hAnsi="Calibri"/>
+                <w:b/>
+                <w:bCs/>
+                <w:color w:val="1F3A68"/>
+                <w:sz w:val="18"/>
+                <w:szCs w:val="18"/>
+              </w:rPr>
               <w:t xml:space="preserve">Audit log</w:t>
             </w:r>
           </w:p>
@@ -9125,6 +9396,7 @@
               <w:bottom w:val="single" w:color="C9D4E6" w:sz="4"/>
               <w:right w:val="single" w:color="C9D4E6" w:sz="4"/>
             </w:tcBorders>
+            <w:shd w:fill="F4F7FC" w:color="auto" w:val="clear"/>
             <w:tcMar>
               <w:top w:type="dxa" w:w="70"/>
               <w:left w:type="dxa" w:w="100"/>
@@ -9158,6 +9430,7 @@
               <w:bottom w:val="single" w:color="C9D4E6" w:sz="4"/>
               <w:right w:val="single" w:color="C9D4E6" w:sz="4"/>
             </w:tcBorders>
+            <w:shd w:fill="F4F7FC" w:color="auto" w:val="clear"/>
             <w:tcMar>
               <w:top w:type="dxa" w:w="70"/>
               <w:left w:type="dxa" w:w="100"/>
@@ -9191,6 +9464,7 @@
               <w:bottom w:val="single" w:color="C9D4E6" w:sz="4"/>
               <w:right w:val="single" w:color="C9D4E6" w:sz="4"/>
             </w:tcBorders>
+            <w:shd w:fill="F4F7FC" w:color="auto" w:val="clear"/>
             <w:tcMar>
               <w:top w:type="dxa" w:w="70"/>
               <w:left w:type="dxa" w:w="100"/>
@@ -9224,6 +9498,7 @@
               <w:bottom w:val="single" w:color="C9D4E6" w:sz="4"/>
               <w:right w:val="single" w:color="C9D4E6" w:sz="4"/>
             </w:tcBorders>
+            <w:shd w:fill="F4F7FC" w:color="auto" w:val="clear"/>
             <w:tcMar>
               <w:top w:type="dxa" w:w="70"/>
               <w:left w:type="dxa" w:w="100"/>
@@ -9257,6 +9532,7 @@
               <w:bottom w:val="single" w:color="C9D4E6" w:sz="4"/>
               <w:right w:val="single" w:color="C9D4E6" w:sz="4"/>
             </w:tcBorders>
+            <w:shd w:fill="F4F7FC" w:color="auto" w:val="clear"/>
             <w:tcMar>
               <w:top w:type="dxa" w:w="70"/>
               <w:left w:type="dxa" w:w="100"/>
@@ -9290,6 +9566,7 @@
               <w:bottom w:val="single" w:color="C9D4E6" w:sz="4"/>
               <w:right w:val="single" w:color="C9D4E6" w:sz="4"/>
             </w:tcBorders>
+            <w:shd w:fill="F4F7FC" w:color="auto" w:val="clear"/>
             <w:tcMar>
               <w:top w:type="dxa" w:w="70"/>
               <w:left w:type="dxa" w:w="100"/>
@@ -9323,6 +9600,7 @@
               <w:bottom w:val="single" w:color="C9D4E6" w:sz="4"/>
               <w:right w:val="single" w:color="C9D4E6" w:sz="4"/>
             </w:tcBorders>
+            <w:shd w:fill="F4F7FC" w:color="auto" w:val="clear"/>
             <w:tcMar>
               <w:top w:type="dxa" w:w="70"/>
               <w:left w:type="dxa" w:w="100"/>
@@ -10745,7 +11023,7 @@
                 <w:sz w:val="18"/>
                 <w:szCs w:val="18"/>
               </w:rPr>
-              <w:t xml:space="preserve">Finance defines funds with type, Zakat flag, restriction note and active status.</w:t>
+              <w:t xml:space="preserve">Finance (and Manager, Campaign Manager) define funds with type, Zakat flag, restriction note and active status. Funds have their own permission area, separate from campaigns.</w:t>
             </w:r>
           </w:p>
         </w:tc>
@@ -48913,7 +49191,7 @@
         <w:sz w:val="17"/>
         <w:szCs w:val="17"/>
       </w:rPr>
-      <w:t xml:space="preserve">	SRS / BRD  v1.2</w:t>
+      <w:t xml:space="preserve">	SRS / BRD  v1.3</w:t>
     </w:r>
   </w:p>
 </w:hdr>

</xml_diff>

<commit_message>
W03-D5: ledger:verify, money drift and MySQL concurrency tests; real demo donations; Finance may export (FR-FIN-01, BR-03/05/07)
</commit_message>
<xml_diff>
--- a/docs/Donation_Management_System_SRS_BRD.docx
+++ b/docs/Donation_Management_System_SRS_BRD.docx
@@ -5473,7 +5473,7 @@
           <w:sz w:val="18"/>
           <w:szCs w:val="18"/>
         </w:rPr>
-        <w:t xml:space="preserve">F = full control · C = create / edit · A = approve · V = view only · – = no access. Donors are a separate guard and only see their own data.</w:t>
+        <w:t xml:space="preserve">F = full control · C = create / edit · CE = create / edit + export · A = approve · V = view only · – = no access. Donors are a separate guard and only see their own data.</w:t>
       </w:r>
     </w:p>
     <w:tbl>
@@ -7019,7 +7019,7 @@
                 <w:sz w:val="18"/>
                 <w:szCs w:val="18"/>
               </w:rPr>
-              <w:t xml:space="preserve">C</w:t>
+              <w:t xml:space="preserve">CE</w:t>
             </w:r>
           </w:p>
         </w:tc>

</xml_diff>